<commit_message>
add first version of thesis docx and figure
</commit_message>
<xml_diff>
--- a/docs/thesis/thesis-vahidMoradi.docx
+++ b/docs/thesis/thesis-vahidMoradi.docx
@@ -25,11 +25,11 @@
               <w:spacing w:after="0" w:line="240" w:lineRule="auto"/>
               <w:jc w:val="center"/>
               <w:rPr>
+                <w:rFonts w:hint="cs"/>
                 <w:color w:val="000000"/>
                 <w:sz w:val="32"/>
                 <w:szCs w:val="32"/>
                 <w:rtl/>
-                <w:lang w:bidi="ar-SA"/>
               </w:rPr>
             </w:pPr>
             <w:r>
@@ -420,12 +420,12 @@
             </w:pPr>
             <w:r>
               <w:rPr>
-                <w:rFonts w:cs="B Nazanin" w:hint="cs"/>
+                <w:rFonts w:cs="B Nazanin"/>
                 <w:sz w:val="28"/>
                 <w:szCs w:val="32"/>
                 <w:rtl/>
               </w:rPr>
-              <w:t>عنوان</w:t>
+              <w:t>بررسی، ارزیابی و تحلیل کاربردهای رویکرد مبتنی بر خوشه‌بندی معنایی متون چند زبانه جهت پاسخگویی به سوالات در محیط‌های با دامنه‌بسته</w:t>
             </w:r>
           </w:p>
           <w:p>
@@ -11892,7 +11892,7 @@
               <w:spacing w:after="0" w:line="240" w:lineRule="auto"/>
               <w:jc w:val="center"/>
               <w:rPr>
-                <w:rFonts w:ascii="B Nazanin" w:hint="cs"/>
+                <w:rFonts w:ascii="B Nazanin"/>
                 <w:b/>
                 <w:bCs/>
                 <w:color w:val="000000"/>
@@ -41685,6 +41685,7 @@
   <w:style w:type="character" w:default="1" w:styleId="DefaultParagraphFont">
     <w:name w:val="Default Paragraph Font"/>
     <w:uiPriority w:val="1"/>
+    <w:semiHidden/>
     <w:unhideWhenUsed/>
   </w:style>
   <w:style w:type="table" w:default="1" w:styleId="TableNormal">

</xml_diff>